<commit_message>
Creacion de Inventario y abierto para nuevo extensiones
</commit_message>
<xml_diff>
--- a/Archivos/Sources/Pruebas.docx
+++ b/Archivos/Sources/Pruebas.docx
@@ -9,14 +9,12 @@
           <w:lang w:val="en-US"/>
         </w:rPr>
       </w:pPr>
-      <w:proofErr w:type="spellStart"/>
       <w:r>
         <w:rPr>
           <w:lang w:val="en-US"/>
         </w:rPr>
         <w:t>Pruebas</w:t>
       </w:r>
-      <w:proofErr w:type="spellEnd"/>
     </w:p>
     <w:p>
       <w:pPr>
@@ -155,6 +153,7 @@
       </w:pPr>
       <w:r>
         <w:rPr>
+          <w:noProof/>
           <w:lang w:val="en-US"/>
         </w:rPr>
         <w:drawing>
@@ -202,6 +201,7 @@
       </w:pPr>
       <w:r>
         <w:rPr>
+          <w:noProof/>
           <w:lang w:val="en-US"/>
         </w:rPr>
         <w:lastRenderedPageBreak/>
@@ -252,21 +252,7 @@
         <w:rPr>
           <w:lang w:val="en-US"/>
         </w:rPr>
-        <w:t xml:space="preserve">HU3 – </w:t>
-      </w:r>
-      <w:proofErr w:type="spellStart"/>
-      <w:r>
-        <w:rPr>
-          <w:lang w:val="en-US"/>
-        </w:rPr>
-        <w:t>Edicion</w:t>
-      </w:r>
-      <w:proofErr w:type="spellEnd"/>
-      <w:r>
-        <w:rPr>
-          <w:lang w:val="en-US"/>
-        </w:rPr>
-        <w:t xml:space="preserve"> de usuario</w:t>
+        <w:t>HU3 – Edicion de usuario</w:t>
       </w:r>
     </w:p>
     <w:p>
@@ -278,6 +264,7 @@
       </w:pPr>
       <w:r>
         <w:rPr>
+          <w:noProof/>
           <w:lang w:val="en-US"/>
         </w:rPr>
         <w:drawing>
@@ -318,6 +305,7 @@
       </w:r>
       <w:r>
         <w:rPr>
+          <w:noProof/>
           <w:lang w:val="en-US"/>
         </w:rPr>
         <w:drawing>
@@ -365,6 +353,7 @@
       </w:pPr>
       <w:r>
         <w:rPr>
+          <w:noProof/>
           <w:lang w:val="en-US"/>
         </w:rPr>
         <w:lastRenderedPageBreak/>
@@ -393,6 +382,818 @@
                     <a:xfrm>
                       <a:off x="0" y="0"/>
                       <a:ext cx="5229955" cy="1228896"/>
+                    </a:xfrm>
+                    <a:prstGeom prst="rect">
+                      <a:avLst/>
+                    </a:prstGeom>
+                  </pic:spPr>
+                </pic:pic>
+              </a:graphicData>
+            </a:graphic>
+          </wp:inline>
+        </w:drawing>
+      </w:r>
+    </w:p>
+    <w:p>
+      <w:pPr>
+        <w:rPr>
+          <w:lang w:val="en-US"/>
+        </w:rPr>
+      </w:pPr>
+      <w:r>
+        <w:rPr>
+          <w:lang w:val="en-US"/>
+        </w:rPr>
+        <w:t>HU07- Registro de Productos</w:t>
+      </w:r>
+    </w:p>
+    <w:p>
+      <w:pPr>
+        <w:rPr>
+          <w:lang w:val="en-US"/>
+        </w:rPr>
+      </w:pPr>
+      <w:r>
+        <w:rPr>
+          <w:lang w:val="en-US"/>
+        </w:rPr>
+        <w:t>Testing Manual</w:t>
+      </w:r>
+    </w:p>
+    <w:p>
+      <w:pPr>
+        <w:jc w:val="center"/>
+        <w:rPr>
+          <w:lang w:val="en-US"/>
+        </w:rPr>
+      </w:pPr>
+      <w:r>
+        <w:rPr>
+          <w:lang w:val="en-US"/>
+        </w:rPr>
+        <w:drawing>
+          <wp:inline distT="0" distB="0" distL="0" distR="0" wp14:anchorId="2D0ADD8A" wp14:editId="67AAAE5E">
+            <wp:extent cx="2652393" cy="2427514"/>
+            <wp:effectExtent l="0" t="0" r="0" b="0"/>
+            <wp:docPr id="1622830740" name="Imagen 1"/>
+            <wp:cNvGraphicFramePr>
+              <a:graphicFrameLocks xmlns:a="http://schemas.openxmlformats.org/drawingml/2006/main" noChangeAspect="1"/>
+            </wp:cNvGraphicFramePr>
+            <a:graphic xmlns:a="http://schemas.openxmlformats.org/drawingml/2006/main">
+              <a:graphicData uri="http://schemas.openxmlformats.org/drawingml/2006/picture">
+                <pic:pic xmlns:pic="http://schemas.openxmlformats.org/drawingml/2006/picture">
+                  <pic:nvPicPr>
+                    <pic:cNvPr id="1622830740" name=""/>
+                    <pic:cNvPicPr/>
+                  </pic:nvPicPr>
+                  <pic:blipFill>
+                    <a:blip r:embed="rId11"/>
+                    <a:stretch>
+                      <a:fillRect/>
+                    </a:stretch>
+                  </pic:blipFill>
+                  <pic:spPr>
+                    <a:xfrm>
+                      <a:off x="0" y="0"/>
+                      <a:ext cx="2664618" cy="2438702"/>
+                    </a:xfrm>
+                    <a:prstGeom prst="rect">
+                      <a:avLst/>
+                    </a:prstGeom>
+                  </pic:spPr>
+                </pic:pic>
+              </a:graphicData>
+            </a:graphic>
+          </wp:inline>
+        </w:drawing>
+      </w:r>
+    </w:p>
+    <w:p>
+      <w:r>
+        <w:t>Producto ya registrador con i</w:t>
+      </w:r>
+      <w:r>
+        <w:t xml:space="preserve">d </w:t>
+      </w:r>
+    </w:p>
+    <w:p>
+      <w:pPr>
+        <w:rPr>
+          <w:lang w:val="en-US"/>
+        </w:rPr>
+      </w:pPr>
+      <w:r>
+        <w:rPr>
+          <w:lang w:val="en-US"/>
+        </w:rPr>
+        <w:drawing>
+          <wp:inline distT="0" distB="0" distL="0" distR="0" wp14:anchorId="608BFBDB" wp14:editId="1B0F3AF4">
+            <wp:extent cx="2783230" cy="2547258"/>
+            <wp:effectExtent l="0" t="0" r="0" b="5715"/>
+            <wp:docPr id="128358632" name="Imagen 1"/>
+            <wp:cNvGraphicFramePr>
+              <a:graphicFrameLocks xmlns:a="http://schemas.openxmlformats.org/drawingml/2006/main" noChangeAspect="1"/>
+            </wp:cNvGraphicFramePr>
+            <a:graphic xmlns:a="http://schemas.openxmlformats.org/drawingml/2006/main">
+              <a:graphicData uri="http://schemas.openxmlformats.org/drawingml/2006/picture">
+                <pic:pic xmlns:pic="http://schemas.openxmlformats.org/drawingml/2006/picture">
+                  <pic:nvPicPr>
+                    <pic:cNvPr id="128358632" name=""/>
+                    <pic:cNvPicPr/>
+                  </pic:nvPicPr>
+                  <pic:blipFill>
+                    <a:blip r:embed="rId11"/>
+                    <a:stretch>
+                      <a:fillRect/>
+                    </a:stretch>
+                  </pic:blipFill>
+                  <pic:spPr>
+                    <a:xfrm>
+                      <a:off x="0" y="0"/>
+                      <a:ext cx="2785648" cy="2549471"/>
+                    </a:xfrm>
+                    <a:prstGeom prst="rect">
+                      <a:avLst/>
+                    </a:prstGeom>
+                  </pic:spPr>
+                </pic:pic>
+              </a:graphicData>
+            </a:graphic>
+          </wp:inline>
+        </w:drawing>
+      </w:r>
+    </w:p>
+    <w:p>
+      <w:r>
+        <w:t xml:space="preserve">Precio de compra no puede </w:t>
+      </w:r>
+      <w:r>
+        <w:t xml:space="preserve">ser 0 </w:t>
+      </w:r>
+    </w:p>
+    <w:p>
+      <w:r>
+        <w:lastRenderedPageBreak/>
+        <w:drawing>
+          <wp:inline distT="0" distB="0" distL="0" distR="0" wp14:anchorId="3C62CBF8" wp14:editId="479BD665">
+            <wp:extent cx="5400040" cy="5112385"/>
+            <wp:effectExtent l="0" t="0" r="0" b="0"/>
+            <wp:docPr id="804055148" name="Imagen 1"/>
+            <wp:cNvGraphicFramePr>
+              <a:graphicFrameLocks xmlns:a="http://schemas.openxmlformats.org/drawingml/2006/main" noChangeAspect="1"/>
+            </wp:cNvGraphicFramePr>
+            <a:graphic xmlns:a="http://schemas.openxmlformats.org/drawingml/2006/main">
+              <a:graphicData uri="http://schemas.openxmlformats.org/drawingml/2006/picture">
+                <pic:pic xmlns:pic="http://schemas.openxmlformats.org/drawingml/2006/picture">
+                  <pic:nvPicPr>
+                    <pic:cNvPr id="804055148" name=""/>
+                    <pic:cNvPicPr/>
+                  </pic:nvPicPr>
+                  <pic:blipFill>
+                    <a:blip r:embed="rId12"/>
+                    <a:stretch>
+                      <a:fillRect/>
+                    </a:stretch>
+                  </pic:blipFill>
+                  <pic:spPr>
+                    <a:xfrm>
+                      <a:off x="0" y="0"/>
+                      <a:ext cx="5400040" cy="5112385"/>
+                    </a:xfrm>
+                    <a:prstGeom prst="rect">
+                      <a:avLst/>
+                    </a:prstGeom>
+                  </pic:spPr>
+                </pic:pic>
+              </a:graphicData>
+            </a:graphic>
+          </wp:inline>
+        </w:drawing>
+      </w:r>
+    </w:p>
+    <w:p>
+      <w:r>
+        <w:t>Precio de Venta no puede ser menor a de compra</w:t>
+      </w:r>
+    </w:p>
+    <w:p>
+      <w:pPr>
+        <w:jc w:val="center"/>
+      </w:pPr>
+      <w:r>
+        <w:drawing>
+          <wp:inline distT="0" distB="0" distL="0" distR="0" wp14:anchorId="646D8A12" wp14:editId="13B6F196">
+            <wp:extent cx="3176937" cy="3058886"/>
+            <wp:effectExtent l="0" t="0" r="4445" b="8255"/>
+            <wp:docPr id="402281714" name="Imagen 1"/>
+            <wp:cNvGraphicFramePr>
+              <a:graphicFrameLocks xmlns:a="http://schemas.openxmlformats.org/drawingml/2006/main" noChangeAspect="1"/>
+            </wp:cNvGraphicFramePr>
+            <a:graphic xmlns:a="http://schemas.openxmlformats.org/drawingml/2006/main">
+              <a:graphicData uri="http://schemas.openxmlformats.org/drawingml/2006/picture">
+                <pic:pic xmlns:pic="http://schemas.openxmlformats.org/drawingml/2006/picture">
+                  <pic:nvPicPr>
+                    <pic:cNvPr id="402281714" name=""/>
+                    <pic:cNvPicPr/>
+                  </pic:nvPicPr>
+                  <pic:blipFill>
+                    <a:blip r:embed="rId13"/>
+                    <a:stretch>
+                      <a:fillRect/>
+                    </a:stretch>
+                  </pic:blipFill>
+                  <pic:spPr>
+                    <a:xfrm>
+                      <a:off x="0" y="0"/>
+                      <a:ext cx="3180272" cy="3062097"/>
+                    </a:xfrm>
+                    <a:prstGeom prst="rect">
+                      <a:avLst/>
+                    </a:prstGeom>
+                  </pic:spPr>
+                </pic:pic>
+              </a:graphicData>
+            </a:graphic>
+          </wp:inline>
+        </w:drawing>
+      </w:r>
+    </w:p>
+    <w:p>
+      <w:pPr>
+        <w:jc w:val="center"/>
+      </w:pPr>
+    </w:p>
+    <w:p>
+      <w:r>
+        <w:lastRenderedPageBreak/>
+        <w:t>HU-8 Editar Producto</w:t>
+      </w:r>
+    </w:p>
+    <w:p>
+      <w:r>
+        <w:drawing>
+          <wp:inline distT="0" distB="0" distL="0" distR="0" wp14:anchorId="5BDBB318" wp14:editId="33C63403">
+            <wp:extent cx="5400040" cy="3502025"/>
+            <wp:effectExtent l="0" t="0" r="0" b="3175"/>
+            <wp:docPr id="2141428164" name="Imagen 1"/>
+            <wp:cNvGraphicFramePr>
+              <a:graphicFrameLocks xmlns:a="http://schemas.openxmlformats.org/drawingml/2006/main" noChangeAspect="1"/>
+            </wp:cNvGraphicFramePr>
+            <a:graphic xmlns:a="http://schemas.openxmlformats.org/drawingml/2006/main">
+              <a:graphicData uri="http://schemas.openxmlformats.org/drawingml/2006/picture">
+                <pic:pic xmlns:pic="http://schemas.openxmlformats.org/drawingml/2006/picture">
+                  <pic:nvPicPr>
+                    <pic:cNvPr id="2141428164" name=""/>
+                    <pic:cNvPicPr/>
+                  </pic:nvPicPr>
+                  <pic:blipFill>
+                    <a:blip r:embed="rId14"/>
+                    <a:stretch>
+                      <a:fillRect/>
+                    </a:stretch>
+                  </pic:blipFill>
+                  <pic:spPr>
+                    <a:xfrm>
+                      <a:off x="0" y="0"/>
+                      <a:ext cx="5400040" cy="3502025"/>
+                    </a:xfrm>
+                    <a:prstGeom prst="rect">
+                      <a:avLst/>
+                    </a:prstGeom>
+                  </pic:spPr>
+                </pic:pic>
+              </a:graphicData>
+            </a:graphic>
+          </wp:inline>
+        </w:drawing>
+      </w:r>
+      <w:r>
+        <w:drawing>
+          <wp:inline distT="0" distB="0" distL="0" distR="0" wp14:anchorId="212C9E26" wp14:editId="71EBDF00">
+            <wp:extent cx="5400040" cy="2778125"/>
+            <wp:effectExtent l="0" t="0" r="0" b="3175"/>
+            <wp:docPr id="700803171" name="Imagen 1"/>
+            <wp:cNvGraphicFramePr>
+              <a:graphicFrameLocks xmlns:a="http://schemas.openxmlformats.org/drawingml/2006/main" noChangeAspect="1"/>
+            </wp:cNvGraphicFramePr>
+            <a:graphic xmlns:a="http://schemas.openxmlformats.org/drawingml/2006/main">
+              <a:graphicData uri="http://schemas.openxmlformats.org/drawingml/2006/picture">
+                <pic:pic xmlns:pic="http://schemas.openxmlformats.org/drawingml/2006/picture">
+                  <pic:nvPicPr>
+                    <pic:cNvPr id="700803171" name=""/>
+                    <pic:cNvPicPr/>
+                  </pic:nvPicPr>
+                  <pic:blipFill>
+                    <a:blip r:embed="rId15"/>
+                    <a:stretch>
+                      <a:fillRect/>
+                    </a:stretch>
+                  </pic:blipFill>
+                  <pic:spPr>
+                    <a:xfrm>
+                      <a:off x="0" y="0"/>
+                      <a:ext cx="5400040" cy="2778125"/>
+                    </a:xfrm>
+                    <a:prstGeom prst="rect">
+                      <a:avLst/>
+                    </a:prstGeom>
+                  </pic:spPr>
+                </pic:pic>
+              </a:graphicData>
+            </a:graphic>
+          </wp:inline>
+        </w:drawing>
+      </w:r>
+      <w:r>
+        <w:drawing>
+          <wp:inline distT="0" distB="0" distL="0" distR="0" wp14:anchorId="44BB26B2" wp14:editId="5AC85879">
+            <wp:extent cx="4772691" cy="1133633"/>
+            <wp:effectExtent l="0" t="0" r="8890" b="9525"/>
+            <wp:docPr id="1361774396" name="Imagen 1"/>
+            <wp:cNvGraphicFramePr>
+              <a:graphicFrameLocks xmlns:a="http://schemas.openxmlformats.org/drawingml/2006/main" noChangeAspect="1"/>
+            </wp:cNvGraphicFramePr>
+            <a:graphic xmlns:a="http://schemas.openxmlformats.org/drawingml/2006/main">
+              <a:graphicData uri="http://schemas.openxmlformats.org/drawingml/2006/picture">
+                <pic:pic xmlns:pic="http://schemas.openxmlformats.org/drawingml/2006/picture">
+                  <pic:nvPicPr>
+                    <pic:cNvPr id="1361774396" name=""/>
+                    <pic:cNvPicPr/>
+                  </pic:nvPicPr>
+                  <pic:blipFill>
+                    <a:blip r:embed="rId16"/>
+                    <a:stretch>
+                      <a:fillRect/>
+                    </a:stretch>
+                  </pic:blipFill>
+                  <pic:spPr>
+                    <a:xfrm>
+                      <a:off x="0" y="0"/>
+                      <a:ext cx="4772691" cy="1133633"/>
+                    </a:xfrm>
+                    <a:prstGeom prst="rect">
+                      <a:avLst/>
+                    </a:prstGeom>
+                  </pic:spPr>
+                </pic:pic>
+              </a:graphicData>
+            </a:graphic>
+          </wp:inline>
+        </w:drawing>
+      </w:r>
+    </w:p>
+    <w:p/>
+    <w:p/>
+    <w:p/>
+    <w:p/>
+    <w:p>
+      <w:r>
+        <w:lastRenderedPageBreak/>
+        <w:t>HU-10</w:t>
+      </w:r>
+    </w:p>
+    <w:p>
+      <w:pPr>
+        <w:jc w:val="center"/>
+      </w:pPr>
+      <w:r>
+        <w:t>Testing Manual</w:t>
+      </w:r>
+    </w:p>
+    <w:p>
+      <w:r>
+        <w:drawing>
+          <wp:inline distT="0" distB="0" distL="0" distR="0" wp14:anchorId="1AB2F4A5" wp14:editId="5E602473">
+            <wp:extent cx="3410426" cy="2829320"/>
+            <wp:effectExtent l="0" t="0" r="0" b="9525"/>
+            <wp:docPr id="851357090" name="Imagen 1"/>
+            <wp:cNvGraphicFramePr>
+              <a:graphicFrameLocks xmlns:a="http://schemas.openxmlformats.org/drawingml/2006/main" noChangeAspect="1"/>
+            </wp:cNvGraphicFramePr>
+            <a:graphic xmlns:a="http://schemas.openxmlformats.org/drawingml/2006/main">
+              <a:graphicData uri="http://schemas.openxmlformats.org/drawingml/2006/picture">
+                <pic:pic xmlns:pic="http://schemas.openxmlformats.org/drawingml/2006/picture">
+                  <pic:nvPicPr>
+                    <pic:cNvPr id="851357090" name=""/>
+                    <pic:cNvPicPr/>
+                  </pic:nvPicPr>
+                  <pic:blipFill>
+                    <a:blip r:embed="rId17"/>
+                    <a:stretch>
+                      <a:fillRect/>
+                    </a:stretch>
+                  </pic:blipFill>
+                  <pic:spPr>
+                    <a:xfrm>
+                      <a:off x="0" y="0"/>
+                      <a:ext cx="3410426" cy="2829320"/>
+                    </a:xfrm>
+                    <a:prstGeom prst="rect">
+                      <a:avLst/>
+                    </a:prstGeom>
+                  </pic:spPr>
+                </pic:pic>
+              </a:graphicData>
+            </a:graphic>
+          </wp:inline>
+        </w:drawing>
+      </w:r>
+      <w:r>
+        <w:drawing>
+          <wp:inline distT="0" distB="0" distL="0" distR="0" wp14:anchorId="044C3EAE" wp14:editId="7C0D5048">
+            <wp:extent cx="3439005" cy="2791215"/>
+            <wp:effectExtent l="0" t="0" r="0" b="9525"/>
+            <wp:docPr id="1440928077" name="Imagen 1"/>
+            <wp:cNvGraphicFramePr>
+              <a:graphicFrameLocks xmlns:a="http://schemas.openxmlformats.org/drawingml/2006/main" noChangeAspect="1"/>
+            </wp:cNvGraphicFramePr>
+            <a:graphic xmlns:a="http://schemas.openxmlformats.org/drawingml/2006/main">
+              <a:graphicData uri="http://schemas.openxmlformats.org/drawingml/2006/picture">
+                <pic:pic xmlns:pic="http://schemas.openxmlformats.org/drawingml/2006/picture">
+                  <pic:nvPicPr>
+                    <pic:cNvPr id="1440928077" name=""/>
+                    <pic:cNvPicPr/>
+                  </pic:nvPicPr>
+                  <pic:blipFill>
+                    <a:blip r:embed="rId18"/>
+                    <a:stretch>
+                      <a:fillRect/>
+                    </a:stretch>
+                  </pic:blipFill>
+                  <pic:spPr>
+                    <a:xfrm>
+                      <a:off x="0" y="0"/>
+                      <a:ext cx="3439005" cy="2791215"/>
+                    </a:xfrm>
+                    <a:prstGeom prst="rect">
+                      <a:avLst/>
+                    </a:prstGeom>
+                  </pic:spPr>
+                </pic:pic>
+              </a:graphicData>
+            </a:graphic>
+          </wp:inline>
+        </w:drawing>
+      </w:r>
+      <w:r>
+        <w:drawing>
+          <wp:inline distT="0" distB="0" distL="0" distR="0" wp14:anchorId="2BE115B8" wp14:editId="750AF747">
+            <wp:extent cx="3315163" cy="2229161"/>
+            <wp:effectExtent l="0" t="0" r="0" b="0"/>
+            <wp:docPr id="815812775" name="Imagen 1"/>
+            <wp:cNvGraphicFramePr>
+              <a:graphicFrameLocks xmlns:a="http://schemas.openxmlformats.org/drawingml/2006/main" noChangeAspect="1"/>
+            </wp:cNvGraphicFramePr>
+            <a:graphic xmlns:a="http://schemas.openxmlformats.org/drawingml/2006/main">
+              <a:graphicData uri="http://schemas.openxmlformats.org/drawingml/2006/picture">
+                <pic:pic xmlns:pic="http://schemas.openxmlformats.org/drawingml/2006/picture">
+                  <pic:nvPicPr>
+                    <pic:cNvPr id="815812775" name=""/>
+                    <pic:cNvPicPr/>
+                  </pic:nvPicPr>
+                  <pic:blipFill>
+                    <a:blip r:embed="rId19"/>
+                    <a:stretch>
+                      <a:fillRect/>
+                    </a:stretch>
+                  </pic:blipFill>
+                  <pic:spPr>
+                    <a:xfrm>
+                      <a:off x="0" y="0"/>
+                      <a:ext cx="3315163" cy="2229161"/>
+                    </a:xfrm>
+                    <a:prstGeom prst="rect">
+                      <a:avLst/>
+                    </a:prstGeom>
+                  </pic:spPr>
+                </pic:pic>
+              </a:graphicData>
+            </a:graphic>
+          </wp:inline>
+        </w:drawing>
+      </w:r>
+    </w:p>
+    <w:p>
+      <w:r>
+        <w:t xml:space="preserve">Buscar código o nombre que no existe </w:t>
+      </w:r>
+    </w:p>
+    <w:p>
+      <w:r>
+        <w:lastRenderedPageBreak/>
+        <w:drawing>
+          <wp:inline distT="0" distB="0" distL="0" distR="0" wp14:anchorId="52C9A2BE" wp14:editId="1C753555">
+            <wp:extent cx="3305636" cy="1914792"/>
+            <wp:effectExtent l="0" t="0" r="9525" b="9525"/>
+            <wp:docPr id="1399066869" name="Imagen 1"/>
+            <wp:cNvGraphicFramePr>
+              <a:graphicFrameLocks xmlns:a="http://schemas.openxmlformats.org/drawingml/2006/main" noChangeAspect="1"/>
+            </wp:cNvGraphicFramePr>
+            <a:graphic xmlns:a="http://schemas.openxmlformats.org/drawingml/2006/main">
+              <a:graphicData uri="http://schemas.openxmlformats.org/drawingml/2006/picture">
+                <pic:pic xmlns:pic="http://schemas.openxmlformats.org/drawingml/2006/picture">
+                  <pic:nvPicPr>
+                    <pic:cNvPr id="1399066869" name=""/>
+                    <pic:cNvPicPr/>
+                  </pic:nvPicPr>
+                  <pic:blipFill>
+                    <a:blip r:embed="rId20"/>
+                    <a:stretch>
+                      <a:fillRect/>
+                    </a:stretch>
+                  </pic:blipFill>
+                  <pic:spPr>
+                    <a:xfrm>
+                      <a:off x="0" y="0"/>
+                      <a:ext cx="3305636" cy="1914792"/>
+                    </a:xfrm>
+                    <a:prstGeom prst="rect">
+                      <a:avLst/>
+                    </a:prstGeom>
+                  </pic:spPr>
+                </pic:pic>
+              </a:graphicData>
+            </a:graphic>
+          </wp:inline>
+        </w:drawing>
+      </w:r>
+    </w:p>
+    <w:p>
+      <w:r>
+        <w:t xml:space="preserve">HU-15 REGISTRAR PROVVEDOR TESTING AUTOMATIZAFDO </w:t>
+      </w:r>
+    </w:p>
+    <w:p>
+      <w:r>
+        <w:lastRenderedPageBreak/>
+        <w:drawing>
+          <wp:inline distT="0" distB="0" distL="0" distR="0" wp14:anchorId="6A39F6C5" wp14:editId="4E55407B">
+            <wp:extent cx="5400040" cy="3392805"/>
+            <wp:effectExtent l="0" t="0" r="0" b="0"/>
+            <wp:docPr id="1143426677" name="Imagen 1"/>
+            <wp:cNvGraphicFramePr>
+              <a:graphicFrameLocks xmlns:a="http://schemas.openxmlformats.org/drawingml/2006/main" noChangeAspect="1"/>
+            </wp:cNvGraphicFramePr>
+            <a:graphic xmlns:a="http://schemas.openxmlformats.org/drawingml/2006/main">
+              <a:graphicData uri="http://schemas.openxmlformats.org/drawingml/2006/picture">
+                <pic:pic xmlns:pic="http://schemas.openxmlformats.org/drawingml/2006/picture">
+                  <pic:nvPicPr>
+                    <pic:cNvPr id="1143426677" name=""/>
+                    <pic:cNvPicPr/>
+                  </pic:nvPicPr>
+                  <pic:blipFill>
+                    <a:blip r:embed="rId21"/>
+                    <a:stretch>
+                      <a:fillRect/>
+                    </a:stretch>
+                  </pic:blipFill>
+                  <pic:spPr>
+                    <a:xfrm>
+                      <a:off x="0" y="0"/>
+                      <a:ext cx="5400040" cy="3392805"/>
+                    </a:xfrm>
+                    <a:prstGeom prst="rect">
+                      <a:avLst/>
+                    </a:prstGeom>
+                  </pic:spPr>
+                </pic:pic>
+              </a:graphicData>
+            </a:graphic>
+          </wp:inline>
+        </w:drawing>
+      </w:r>
+      <w:r>
+        <w:drawing>
+          <wp:inline distT="0" distB="0" distL="0" distR="0" wp14:anchorId="0C8980E6" wp14:editId="3D32F754">
+            <wp:extent cx="5400040" cy="3277235"/>
+            <wp:effectExtent l="0" t="0" r="0" b="0"/>
+            <wp:docPr id="708686244" name="Imagen 1"/>
+            <wp:cNvGraphicFramePr>
+              <a:graphicFrameLocks xmlns:a="http://schemas.openxmlformats.org/drawingml/2006/main" noChangeAspect="1"/>
+            </wp:cNvGraphicFramePr>
+            <a:graphic xmlns:a="http://schemas.openxmlformats.org/drawingml/2006/main">
+              <a:graphicData uri="http://schemas.openxmlformats.org/drawingml/2006/picture">
+                <pic:pic xmlns:pic="http://schemas.openxmlformats.org/drawingml/2006/picture">
+                  <pic:nvPicPr>
+                    <pic:cNvPr id="708686244" name=""/>
+                    <pic:cNvPicPr/>
+                  </pic:nvPicPr>
+                  <pic:blipFill>
+                    <a:blip r:embed="rId22"/>
+                    <a:stretch>
+                      <a:fillRect/>
+                    </a:stretch>
+                  </pic:blipFill>
+                  <pic:spPr>
+                    <a:xfrm>
+                      <a:off x="0" y="0"/>
+                      <a:ext cx="5400040" cy="3277235"/>
+                    </a:xfrm>
+                    <a:prstGeom prst="rect">
+                      <a:avLst/>
+                    </a:prstGeom>
+                  </pic:spPr>
+                </pic:pic>
+              </a:graphicData>
+            </a:graphic>
+          </wp:inline>
+        </w:drawing>
+      </w:r>
+      <w:r>
+        <w:drawing>
+          <wp:inline distT="0" distB="0" distL="0" distR="0" wp14:anchorId="7235B5E0" wp14:editId="118F53B4">
+            <wp:extent cx="4229690" cy="1286054"/>
+            <wp:effectExtent l="0" t="0" r="0" b="9525"/>
+            <wp:docPr id="431293315" name="Imagen 1"/>
+            <wp:cNvGraphicFramePr>
+              <a:graphicFrameLocks xmlns:a="http://schemas.openxmlformats.org/drawingml/2006/main" noChangeAspect="1"/>
+            </wp:cNvGraphicFramePr>
+            <a:graphic xmlns:a="http://schemas.openxmlformats.org/drawingml/2006/main">
+              <a:graphicData uri="http://schemas.openxmlformats.org/drawingml/2006/picture">
+                <pic:pic xmlns:pic="http://schemas.openxmlformats.org/drawingml/2006/picture">
+                  <pic:nvPicPr>
+                    <pic:cNvPr id="431293315" name=""/>
+                    <pic:cNvPicPr/>
+                  </pic:nvPicPr>
+                  <pic:blipFill>
+                    <a:blip r:embed="rId23"/>
+                    <a:stretch>
+                      <a:fillRect/>
+                    </a:stretch>
+                  </pic:blipFill>
+                  <pic:spPr>
+                    <a:xfrm>
+                      <a:off x="0" y="0"/>
+                      <a:ext cx="4229690" cy="1286054"/>
+                    </a:xfrm>
+                    <a:prstGeom prst="rect">
+                      <a:avLst/>
+                    </a:prstGeom>
+                  </pic:spPr>
+                </pic:pic>
+              </a:graphicData>
+            </a:graphic>
+          </wp:inline>
+        </w:drawing>
+      </w:r>
+    </w:p>
+    <w:p/>
+    <w:p/>
+    <w:p/>
+    <w:p>
+      <w:r>
+        <w:lastRenderedPageBreak/>
+        <w:t xml:space="preserve">HU 18.Registrar Cliente </w:t>
+      </w:r>
+    </w:p>
+    <w:p>
+      <w:r>
+        <w:drawing>
+          <wp:inline distT="0" distB="0" distL="0" distR="0" wp14:anchorId="1ED3C48F" wp14:editId="60A0DFB5">
+            <wp:extent cx="5400040" cy="3636010"/>
+            <wp:effectExtent l="0" t="0" r="0" b="2540"/>
+            <wp:docPr id="1073459157" name="Imagen 1"/>
+            <wp:cNvGraphicFramePr>
+              <a:graphicFrameLocks xmlns:a="http://schemas.openxmlformats.org/drawingml/2006/main" noChangeAspect="1"/>
+            </wp:cNvGraphicFramePr>
+            <a:graphic xmlns:a="http://schemas.openxmlformats.org/drawingml/2006/main">
+              <a:graphicData uri="http://schemas.openxmlformats.org/drawingml/2006/picture">
+                <pic:pic xmlns:pic="http://schemas.openxmlformats.org/drawingml/2006/picture">
+                  <pic:nvPicPr>
+                    <pic:cNvPr id="1073459157" name=""/>
+                    <pic:cNvPicPr/>
+                  </pic:nvPicPr>
+                  <pic:blipFill>
+                    <a:blip r:embed="rId24"/>
+                    <a:stretch>
+                      <a:fillRect/>
+                    </a:stretch>
+                  </pic:blipFill>
+                  <pic:spPr>
+                    <a:xfrm>
+                      <a:off x="0" y="0"/>
+                      <a:ext cx="5400040" cy="3636010"/>
+                    </a:xfrm>
+                    <a:prstGeom prst="rect">
+                      <a:avLst/>
+                    </a:prstGeom>
+                  </pic:spPr>
+                </pic:pic>
+              </a:graphicData>
+            </a:graphic>
+          </wp:inline>
+        </w:drawing>
+      </w:r>
+      <w:r>
+        <w:drawing>
+          <wp:inline distT="0" distB="0" distL="0" distR="0" wp14:anchorId="4E8A5865" wp14:editId="2C6E0CA9">
+            <wp:extent cx="3810532" cy="1276528"/>
+            <wp:effectExtent l="0" t="0" r="0" b="0"/>
+            <wp:docPr id="1254879666" name="Imagen 1"/>
+            <wp:cNvGraphicFramePr>
+              <a:graphicFrameLocks xmlns:a="http://schemas.openxmlformats.org/drawingml/2006/main" noChangeAspect="1"/>
+            </wp:cNvGraphicFramePr>
+            <a:graphic xmlns:a="http://schemas.openxmlformats.org/drawingml/2006/main">
+              <a:graphicData uri="http://schemas.openxmlformats.org/drawingml/2006/picture">
+                <pic:pic xmlns:pic="http://schemas.openxmlformats.org/drawingml/2006/picture">
+                  <pic:nvPicPr>
+                    <pic:cNvPr id="1254879666" name=""/>
+                    <pic:cNvPicPr/>
+                  </pic:nvPicPr>
+                  <pic:blipFill>
+                    <a:blip r:embed="rId25"/>
+                    <a:stretch>
+                      <a:fillRect/>
+                    </a:stretch>
+                  </pic:blipFill>
+                  <pic:spPr>
+                    <a:xfrm>
+                      <a:off x="0" y="0"/>
+                      <a:ext cx="3810532" cy="1276528"/>
+                    </a:xfrm>
+                    <a:prstGeom prst="rect">
+                      <a:avLst/>
+                    </a:prstGeom>
+                  </pic:spPr>
+                </pic:pic>
+              </a:graphicData>
+            </a:graphic>
+          </wp:inline>
+        </w:drawing>
+      </w:r>
+    </w:p>
+    <w:p>
+      <w:r>
+        <w:t>Hu-22 Modelo Compra</w:t>
+      </w:r>
+    </w:p>
+    <w:p>
+      <w:r>
+        <w:lastRenderedPageBreak/>
+        <w:drawing>
+          <wp:inline distT="0" distB="0" distL="0" distR="0" wp14:anchorId="668CE4D8" wp14:editId="168B187A">
+            <wp:extent cx="5400040" cy="4730750"/>
+            <wp:effectExtent l="0" t="0" r="0" b="0"/>
+            <wp:docPr id="1192949315" name="Imagen 1"/>
+            <wp:cNvGraphicFramePr>
+              <a:graphicFrameLocks xmlns:a="http://schemas.openxmlformats.org/drawingml/2006/main" noChangeAspect="1"/>
+            </wp:cNvGraphicFramePr>
+            <a:graphic xmlns:a="http://schemas.openxmlformats.org/drawingml/2006/main">
+              <a:graphicData uri="http://schemas.openxmlformats.org/drawingml/2006/picture">
+                <pic:pic xmlns:pic="http://schemas.openxmlformats.org/drawingml/2006/picture">
+                  <pic:nvPicPr>
+                    <pic:cNvPr id="1192949315" name=""/>
+                    <pic:cNvPicPr/>
+                  </pic:nvPicPr>
+                  <pic:blipFill>
+                    <a:blip r:embed="rId26"/>
+                    <a:stretch>
+                      <a:fillRect/>
+                    </a:stretch>
+                  </pic:blipFill>
+                  <pic:spPr>
+                    <a:xfrm>
+                      <a:off x="0" y="0"/>
+                      <a:ext cx="5400040" cy="4730750"/>
+                    </a:xfrm>
+                    <a:prstGeom prst="rect">
+                      <a:avLst/>
+                    </a:prstGeom>
+                  </pic:spPr>
+                </pic:pic>
+              </a:graphicData>
+            </a:graphic>
+          </wp:inline>
+        </w:drawing>
+      </w:r>
+    </w:p>
+    <w:p>
+      <w:r>
+        <w:drawing>
+          <wp:inline distT="0" distB="0" distL="0" distR="0" wp14:anchorId="7F8A49A0" wp14:editId="77377343">
+            <wp:extent cx="3515216" cy="1228896"/>
+            <wp:effectExtent l="0" t="0" r="9525" b="0"/>
+            <wp:docPr id="1197013669" name="Imagen 1"/>
+            <wp:cNvGraphicFramePr>
+              <a:graphicFrameLocks xmlns:a="http://schemas.openxmlformats.org/drawingml/2006/main" noChangeAspect="1"/>
+            </wp:cNvGraphicFramePr>
+            <a:graphic xmlns:a="http://schemas.openxmlformats.org/drawingml/2006/main">
+              <a:graphicData uri="http://schemas.openxmlformats.org/drawingml/2006/picture">
+                <pic:pic xmlns:pic="http://schemas.openxmlformats.org/drawingml/2006/picture">
+                  <pic:nvPicPr>
+                    <pic:cNvPr id="1197013669" name=""/>
+                    <pic:cNvPicPr/>
+                  </pic:nvPicPr>
+                  <pic:blipFill>
+                    <a:blip r:embed="rId27"/>
+                    <a:stretch>
+                      <a:fillRect/>
+                    </a:stretch>
+                  </pic:blipFill>
+                  <pic:spPr>
+                    <a:xfrm>
+                      <a:off x="0" y="0"/>
+                      <a:ext cx="3515216" cy="1228896"/>
                     </a:xfrm>
                     <a:prstGeom prst="rect">
                       <a:avLst/>

</xml_diff>